<commit_message>
DOCX: mesma revisao dos PDFs
</commit_message>
<xml_diff>
--- a/cv-docx/CV-Pedro-Albertasse-Dados-PT.docx
+++ b/cv-docx/CV-Pedro-Albertasse-Dados-PT.docx
@@ -70,7 +70,7 @@
         </w:rPr>
         <w:t xml:space="preserve">albertasse.dev@gmail.com  ·  </w:t>
       </w:r>
-      <w:hyperlink w:history="1" r:id="rIdg-dxowkchkghtwlqkrpsc">
+      <w:hyperlink w:history="1" r:id="rIdqxzv4cy4ksgxgipjxmqyb">
         <w:r>
           <w:rPr>
             <w:rFonts w:ascii="Calibri" w:cs="Calibri" w:eastAsia="Calibri" w:hAnsi="Calibri"/>
@@ -98,7 +98,7 @@
         </w:rPr>
         <w:t xml:space="preserve">  ·  </w:t>
       </w:r>
-      <w:hyperlink w:history="1" r:id="rId3_qjsr4ezrna8jgwf7gwa">
+      <w:hyperlink w:history="1" r:id="rIdupsqvhbafqu9nes6fdyr1">
         <w:r>
           <w:rPr>
             <w:rFonts w:ascii="Calibri" w:cs="Calibri" w:eastAsia="Calibri" w:hAnsi="Calibri"/>
@@ -137,24 +137,6 @@
     </w:p>
     <w:p>
       <w:pPr>
-        <w:spacing w:after="40" w:before="140"/>
-      </w:pPr>
-      <w:r>
-        <w:rPr>
-          <w:rFonts w:ascii="Calibri" w:cs="Calibri" w:eastAsia="Calibri" w:hAnsi="Calibri"/>
-          <w:b/>
-          <w:bCs/>
-          <w:i w:val="false"/>
-          <w:iCs w:val="false"/>
-          <w:color w:val="5A5A55"/>
-          <w:sz w:val="18"/>
-          <w:szCs w:val="18"/>
-        </w:rPr>
-        <w:t xml:space="preserve">14 aplicações internas   ·   70+ edge functions   ·   10 agentes de IA em produção   ·   4 matérias na imprensa</w:t>
-      </w:r>
-    </w:p>
-    <w:p>
-      <w:pPr>
         <w:pBdr>
           <w:bottom w:val="single" w:color="D8D7D0" w:sz="6" w:space="3"/>
         </w:pBdr>
@@ -189,7 +171,7 @@
           <w:sz w:val="19"/>
           <w:szCs w:val="19"/>
         </w:rPr>
-        <w:t xml:space="preserve">Entrei na FLOW Executive Finders como estagiário de curadoria de dados. Hoje o pipeline comercial, as 14 aplicações internas e os 10 agentes de IA que a operação usa todo dia são responsabilidade minha, do modelo no warehouse até a tela que o time abre na segunda. Quatro dos levantamentos que montei sobre as empresas do Ibovespa viraram matéria na imprensa de negócios. Sou bacharel em programação de jogos digitais e cheguei em dados por esse caminho.</w:t>
+        <w:t xml:space="preserve">Engenheiro de dados e automação na FLOW Executive Finders, consultoria de executive search em São Paulo. Respondo pelo pipeline comercial, por 14 aplicações internas e por 10 agentes de IA que a operação usa todo dia, do modelo no data warehouse até a tela que o time abre na segunda. Quatro dos levantamentos que montei sobre as empresas do Ibovespa viraram matéria na imprensa de negócios. Sou bacharel em programação de jogos digitais e cheguei em dados por esse caminho.</w:t>
       </w:r>
     </w:p>
     <w:p>

</xml_diff>